<commit_message>
Add new templates for Small Commercial Electricity Service documentation
</commit_message>
<xml_diff>
--- a/contract-lifecycle-management/assets/templates/pc-template.docx
+++ b/contract-lifecycle-management/assets/templates/pc-template.docx
@@ -218,7 +218,6 @@
                 <w:sz w:val="18"/>
                 <w:szCs w:val="18"/>
               </w:rPr>
-              <w:fldChar w:fldCharType="begin"/>
             </w:r>
             <w:r>
               <w:rPr>
@@ -226,7 +225,6 @@
                 <w:sz w:val="18"/>
                 <w:szCs w:val="18"/>
               </w:rPr>
-              <w:instrText xml:space="preserve"> REF ROELegalEntityName </w:instrText>
             </w:r>
             <w:r>
               <w:rPr>
@@ -234,7 +232,6 @@
                 <w:sz w:val="18"/>
                 <w:szCs w:val="18"/>
               </w:rPr>
-              <w:fldChar w:fldCharType="end"/>
             </w:r>
           </w:p>
         </w:tc>
@@ -291,7 +288,6 @@
                 <w:sz w:val="18"/>
                 <w:szCs w:val="18"/>
               </w:rPr>
-              <w:fldChar w:fldCharType="begin"/>
             </w:r>
             <w:r>
               <w:rPr>
@@ -299,7 +295,6 @@
                 <w:sz w:val="18"/>
                 <w:szCs w:val="18"/>
               </w:rPr>
-              <w:instrText xml:space="preserve"> REF NoticeAddrFirstName </w:instrText>
             </w:r>
             <w:r>
               <w:rPr>
@@ -307,7 +302,6 @@
                 <w:sz w:val="18"/>
                 <w:szCs w:val="18"/>
               </w:rPr>
-              <w:fldChar w:fldCharType="end"/>
             </w:r>
             <w:r>
               <w:rPr>
@@ -351,7 +345,6 @@
                 <w:sz w:val="18"/>
                 <w:szCs w:val="18"/>
               </w:rPr>
-              <w:fldChar w:fldCharType="begin"/>
             </w:r>
             <w:r>
               <w:rPr>
@@ -359,7 +352,6 @@
                 <w:sz w:val="18"/>
                 <w:szCs w:val="18"/>
               </w:rPr>
-              <w:instrText xml:space="preserve"> REF NoticeAddrLastName </w:instrText>
             </w:r>
             <w:r>
               <w:rPr>
@@ -367,7 +359,6 @@
                 <w:sz w:val="18"/>
                 <w:szCs w:val="18"/>
               </w:rPr>
-              <w:fldChar w:fldCharType="end"/>
             </w:r>
           </w:p>
         </w:tc>
@@ -422,7 +413,6 @@
                 <w:sz w:val="18"/>
                 <w:szCs w:val="18"/>
               </w:rPr>
-              <w:fldChar w:fldCharType="begin"/>
             </w:r>
             <w:r>
               <w:rPr>
@@ -430,7 +420,6 @@
                 <w:sz w:val="18"/>
                 <w:szCs w:val="18"/>
               </w:rPr>
-              <w:instrText xml:space="preserve"> REF NoticePhoneNum </w:instrText>
             </w:r>
             <w:r>
               <w:rPr>
@@ -438,7 +427,6 @@
                 <w:sz w:val="18"/>
                 <w:szCs w:val="18"/>
               </w:rPr>
-              <w:fldChar w:fldCharType="end"/>
             </w:r>
           </w:p>
         </w:tc>
@@ -527,7 +515,6 @@
                 <w:sz w:val="18"/>
                 <w:szCs w:val="18"/>
               </w:rPr>
-              <w:fldChar w:fldCharType="begin"/>
             </w:r>
             <w:r>
               <w:rPr>
@@ -535,7 +522,6 @@
                 <w:sz w:val="18"/>
                 <w:szCs w:val="18"/>
               </w:rPr>
-              <w:instrText xml:space="preserve"> REF NoticeAddr1 </w:instrText>
             </w:r>
             <w:r>
               <w:rPr>
@@ -543,7 +529,6 @@
                 <w:sz w:val="18"/>
                 <w:szCs w:val="18"/>
               </w:rPr>
-              <w:fldChar w:fldCharType="end"/>
             </w:r>
           </w:p>
         </w:tc>
@@ -711,7 +696,6 @@
                 <w:sz w:val="18"/>
                 <w:szCs w:val="18"/>
               </w:rPr>
-              <w:fldChar w:fldCharType="begin"/>
             </w:r>
             <w:r>
               <w:rPr>
@@ -719,7 +703,6 @@
                 <w:sz w:val="18"/>
                 <w:szCs w:val="18"/>
               </w:rPr>
-              <w:instrText xml:space="preserve"> REF NoticeAddrCity </w:instrText>
             </w:r>
             <w:r>
               <w:rPr>
@@ -727,7 +710,6 @@
                 <w:sz w:val="18"/>
                 <w:szCs w:val="18"/>
               </w:rPr>
-              <w:fldChar w:fldCharType="end"/>
             </w:r>
             <w:r>
               <w:rPr>
@@ -797,7 +779,6 @@
                 <w:sz w:val="18"/>
                 <w:szCs w:val="18"/>
               </w:rPr>
-              <w:fldChar w:fldCharType="begin"/>
             </w:r>
             <w:r>
               <w:rPr>
@@ -805,7 +786,6 @@
                 <w:sz w:val="18"/>
                 <w:szCs w:val="18"/>
               </w:rPr>
-              <w:instrText xml:space="preserve"> REF NoticeAddrState </w:instrText>
             </w:r>
             <w:r>
               <w:rPr>
@@ -813,7 +793,6 @@
                 <w:sz w:val="18"/>
                 <w:szCs w:val="18"/>
               </w:rPr>
-              <w:fldChar w:fldCharType="end"/>
             </w:r>
             <w:r>
               <w:rPr>
@@ -821,7 +800,6 @@
                 <w:sz w:val="18"/>
                 <w:szCs w:val="18"/>
               </w:rPr>
-              <w:fldChar w:fldCharType="begin"/>
             </w:r>
             <w:r>
               <w:rPr>
@@ -829,7 +807,6 @@
                 <w:sz w:val="18"/>
                 <w:szCs w:val="18"/>
               </w:rPr>
-              <w:instrText xml:space="preserve"> REF NoticeAddrZipCode </w:instrText>
             </w:r>
             <w:r>
               <w:rPr>
@@ -837,7 +814,6 @@
                 <w:sz w:val="18"/>
                 <w:szCs w:val="18"/>
               </w:rPr>
-              <w:fldChar w:fldCharType="end"/>
             </w:r>
           </w:p>
         </w:tc>
@@ -1098,7 +1074,6 @@
                 <w:sz w:val="18"/>
                 <w:szCs w:val="18"/>
               </w:rPr>
-              <w:fldChar w:fldCharType="begin"/>
             </w:r>
             <w:r>
               <w:rPr>
@@ -1106,7 +1081,6 @@
                 <w:sz w:val="18"/>
                 <w:szCs w:val="18"/>
               </w:rPr>
-              <w:instrText xml:space="preserve"> REF NoticeEmailAddr </w:instrText>
             </w:r>
             <w:r>
               <w:rPr>
@@ -1114,7 +1088,6 @@
                 <w:sz w:val="18"/>
                 <w:szCs w:val="18"/>
               </w:rPr>
-              <w:fldChar w:fldCharType="end"/>
             </w:r>
           </w:p>
         </w:tc>
@@ -1493,7 +1466,6 @@
                 <w:sz w:val="10"/>
                 <w:szCs w:val="10"/>
               </w:rPr>
-              <w:fldChar w:fldCharType="begin"/>
             </w:r>
             <w:r>
               <w:rPr>
@@ -1503,7 +1475,6 @@
                 <w:sz w:val="10"/>
                 <w:szCs w:val="10"/>
               </w:rPr>
-              <w:instrText xml:space="preserve"> IF</w:instrText>
             </w:r>
             <w:r>
               <w:rPr>
@@ -1513,7 +1484,6 @@
                 <w:sz w:val="10"/>
                 <w:szCs w:val="10"/>
               </w:rPr>
-              <w:fldChar w:fldCharType="begin"/>
             </w:r>
             <w:r>
               <w:rPr>
@@ -1523,7 +1493,6 @@
                 <w:sz w:val="10"/>
                 <w:szCs w:val="10"/>
               </w:rPr>
-              <w:instrText xml:space="preserve"> REF VRPercent </w:instrText>
             </w:r>
             <w:r>
               <w:rPr>
@@ -1533,7 +1502,6 @@
                 <w:sz w:val="10"/>
                 <w:szCs w:val="10"/>
               </w:rPr>
-              <w:instrText xml:space="preserve"> \* MERGEFORMAT </w:instrText>
             </w:r>
             <w:r>
               <w:rPr>
@@ -1543,7 +1511,6 @@
                 <w:sz w:val="10"/>
                 <w:szCs w:val="10"/>
               </w:rPr>
-              <w:fldChar w:fldCharType="end"/>
             </w:r>
             <w:r>
               <w:rPr>
@@ -1553,7 +1520,6 @@
                 <w:sz w:val="10"/>
                 <w:szCs w:val="10"/>
               </w:rPr>
-              <w:instrText xml:space="preserve"> = "100" "</w:instrText>
             </w:r>
             <w:r>
               <w:rPr>
@@ -1563,7 +1529,6 @@
                 <w:sz w:val="18"/>
                 <w:szCs w:val="18"/>
               </w:rPr>
-              <w:instrText>Renewable Percent</w:instrText>
             </w:r>
             <w:r>
               <w:rPr>
@@ -1573,7 +1538,6 @@
                 <w:sz w:val="10"/>
                 <w:szCs w:val="10"/>
               </w:rPr>
-              <w:instrText xml:space="preserve">" "" </w:instrText>
             </w:r>
             <w:r>
               <w:rPr>
@@ -1583,7 +1547,6 @@
                 <w:sz w:val="10"/>
                 <w:szCs w:val="10"/>
               </w:rPr>
-              <w:fldChar w:fldCharType="end"/>
             </w:r>
           </w:p>
         </w:tc>
@@ -1610,7 +1573,6 @@
                 <w:sz w:val="10"/>
                 <w:szCs w:val="10"/>
               </w:rPr>
-              <w:fldChar w:fldCharType="begin"/>
             </w:r>
             <w:r>
               <w:rPr>
@@ -1618,7 +1580,6 @@
                 <w:sz w:val="10"/>
                 <w:szCs w:val="10"/>
               </w:rPr>
-              <w:instrText xml:space="preserve"> IF</w:instrText>
             </w:r>
             <w:r>
               <w:rPr>
@@ -1626,7 +1587,6 @@
                 <w:sz w:val="10"/>
                 <w:szCs w:val="10"/>
               </w:rPr>
-              <w:fldChar w:fldCharType="begin"/>
             </w:r>
             <w:r>
               <w:rPr>
@@ -1634,7 +1594,6 @@
                 <w:sz w:val="10"/>
                 <w:szCs w:val="10"/>
               </w:rPr>
-              <w:instrText xml:space="preserve"> REF VRPercent </w:instrText>
             </w:r>
             <w:r>
               <w:rPr>
@@ -1642,7 +1601,6 @@
                 <w:sz w:val="10"/>
                 <w:szCs w:val="10"/>
               </w:rPr>
-              <w:instrText xml:space="preserve"> \* MERGEFORMAT </w:instrText>
             </w:r>
             <w:r>
               <w:rPr>
@@ -1650,7 +1608,6 @@
                 <w:sz w:val="10"/>
                 <w:szCs w:val="10"/>
               </w:rPr>
-              <w:fldChar w:fldCharType="end"/>
             </w:r>
             <w:r>
               <w:rPr>
@@ -1658,7 +1615,6 @@
                 <w:sz w:val="10"/>
                 <w:szCs w:val="10"/>
               </w:rPr>
-              <w:instrText xml:space="preserve"> = "100" "</w:instrText>
             </w:r>
             <w:r>
               <w:rPr>
@@ -1666,7 +1622,6 @@
                 <w:sz w:val="18"/>
                 <w:szCs w:val="18"/>
               </w:rPr>
-              <w:instrText>100%   -   With the purchase of this product from NRG Business, Customer is supporting cleaner electricity by matching 100% of its electricity usage with certificates representing the environmental benefit of an equivalent amount of power generated from new renewable sources."</w:instrText>
             </w:r>
             <w:r>
               <w:rPr>
@@ -1674,7 +1629,6 @@
                 <w:sz w:val="10"/>
                 <w:szCs w:val="10"/>
               </w:rPr>
-              <w:instrText xml:space="preserve"> "" </w:instrText>
             </w:r>
             <w:r>
               <w:rPr>
@@ -1682,7 +1636,6 @@
                 <w:sz w:val="10"/>
                 <w:szCs w:val="10"/>
               </w:rPr>
-              <w:fldChar w:fldCharType="end"/>
             </w:r>
           </w:p>
         </w:tc>
@@ -1780,7 +1733,6 @@
                 <w:sz w:val="18"/>
                 <w:szCs w:val="18"/>
               </w:rPr>
-              <w:fldChar w:fldCharType="begin"/>
             </w:r>
             <w:r>
               <w:rPr>
@@ -1790,7 +1742,6 @@
                 <w:sz w:val="18"/>
                 <w:szCs w:val="18"/>
               </w:rPr>
-              <w:instrText xml:space="preserve"> =</w:instrText>
             </w:r>
             <w:r>
               <w:rPr>
@@ -1800,7 +1751,6 @@
                 <w:sz w:val="18"/>
                 <w:szCs w:val="18"/>
               </w:rPr>
-              <w:fldChar w:fldCharType="begin"/>
             </w:r>
             <w:r>
               <w:rPr>
@@ -1810,7 +1760,6 @@
                 <w:sz w:val="18"/>
                 <w:szCs w:val="18"/>
               </w:rPr>
-              <w:instrText xml:space="preserve"> REF ContractPrice </w:instrText>
             </w:r>
             <w:r>
               <w:rPr>
@@ -1820,7 +1769,6 @@
                 <w:sz w:val="18"/>
                 <w:szCs w:val="18"/>
               </w:rPr>
-              <w:fldChar w:fldCharType="end"/>
             </w:r>
             <w:r>
               <w:rPr>
@@ -1830,7 +1778,6 @@
                 <w:sz w:val="18"/>
                 <w:szCs w:val="18"/>
               </w:rPr>
-              <w:instrText xml:space="preserve">*100 \# 0.000  </w:instrText>
             </w:r>
             <w:r>
               <w:rPr>
@@ -1840,7 +1787,6 @@
                 <w:sz w:val="18"/>
                 <w:szCs w:val="18"/>
               </w:rPr>
-              <w:fldChar w:fldCharType="end"/>
             </w:r>
             <w:r>
               <w:rPr>
@@ -1876,7 +1822,6 @@
                 <w:sz w:val="18"/>
                 <w:szCs w:val="18"/>
               </w:rPr>
-              <w:fldChar w:fldCharType="begin"/>
             </w:r>
             <w:r>
               <w:rPr>
@@ -1886,7 +1831,6 @@
                 <w:sz w:val="18"/>
                 <w:szCs w:val="18"/>
               </w:rPr>
-              <w:instrText xml:space="preserve"> IF</w:instrText>
             </w:r>
             <w:r>
               <w:rPr>
@@ -1896,7 +1840,6 @@
                 <w:sz w:val="18"/>
                 <w:szCs w:val="18"/>
               </w:rPr>
-              <w:fldChar w:fldCharType="begin"/>
             </w:r>
             <w:r>
               <w:rPr>
@@ -1906,7 +1849,6 @@
                 <w:sz w:val="18"/>
                 <w:szCs w:val="18"/>
               </w:rPr>
-              <w:instrText xml:space="preserve"> REF meterFee </w:instrText>
             </w:r>
             <w:r>
               <w:rPr>
@@ -1916,7 +1858,6 @@
                 <w:sz w:val="18"/>
                 <w:szCs w:val="18"/>
               </w:rPr>
-              <w:instrText xml:space="preserve"> \* MERGEFORMAT </w:instrText>
             </w:r>
             <w:r>
               <w:rPr>
@@ -1926,7 +1867,6 @@
                 <w:sz w:val="18"/>
                 <w:szCs w:val="18"/>
               </w:rPr>
-              <w:fldChar w:fldCharType="end"/>
             </w:r>
             <w:r>
               <w:rPr>
@@ -1936,7 +1876,6 @@
                 <w:sz w:val="18"/>
                 <w:szCs w:val="18"/>
               </w:rPr>
-              <w:instrText xml:space="preserve"> = "" "0.00" </w:instrText>
             </w:r>
             <w:r>
               <w:rPr>
@@ -1946,7 +1885,6 @@
                 <w:sz w:val="18"/>
                 <w:szCs w:val="18"/>
               </w:rPr>
-              <w:fldChar w:fldCharType="begin"/>
             </w:r>
             <w:r>
               <w:rPr>
@@ -1956,7 +1894,6 @@
                 <w:sz w:val="18"/>
                 <w:szCs w:val="18"/>
               </w:rPr>
-              <w:instrText xml:space="preserve"> REF meterFee </w:instrText>
             </w:r>
             <w:r>
               <w:rPr>
@@ -1966,7 +1903,6 @@
                 <w:sz w:val="18"/>
                 <w:szCs w:val="18"/>
               </w:rPr>
-              <w:instrText xml:space="preserve"> \* MERGEFORMAT </w:instrText>
             </w:r>
             <w:r>
               <w:rPr>
@@ -1976,7 +1912,6 @@
                 <w:sz w:val="18"/>
                 <w:szCs w:val="18"/>
               </w:rPr>
-              <w:fldChar w:fldCharType="end"/>
             </w:r>
             <w:r>
               <w:rPr>
@@ -1986,7 +1921,6 @@
                 <w:sz w:val="18"/>
                 <w:szCs w:val="18"/>
               </w:rPr>
-              <w:instrText xml:space="preserve"> </w:instrText>
             </w:r>
             <w:r>
               <w:rPr>
@@ -1996,7 +1930,6 @@
                 <w:sz w:val="18"/>
                 <w:szCs w:val="18"/>
               </w:rPr>
-              <w:fldChar w:fldCharType="separate"/>
             </w:r>
             <w:r>
               <w:rPr>
@@ -2017,7 +1950,6 @@
                 <w:sz w:val="18"/>
                 <w:szCs w:val="18"/>
               </w:rPr>
-              <w:fldChar w:fldCharType="end"/>
             </w:r>
             <w:r>
               <w:rPr>
@@ -2381,7 +2313,6 @@
                 <w:sz w:val="18"/>
                 <w:szCs w:val="18"/>
               </w:rPr>
-              <w:fldChar w:fldCharType="begin"/>
             </w:r>
             <w:r>
               <w:rPr>
@@ -2391,7 +2322,6 @@
                 <w:sz w:val="18"/>
                 <w:szCs w:val="18"/>
               </w:rPr>
-              <w:instrText xml:space="preserve"> REF ContractStartDate \@ "MM/dd/yyyy" </w:instrText>
             </w:r>
             <w:r>
               <w:rPr>
@@ -2401,7 +2331,6 @@
                 <w:sz w:val="18"/>
                 <w:szCs w:val="18"/>
               </w:rPr>
-              <w:fldChar w:fldCharType="end"/>
             </w:r>
           </w:p>
         </w:tc>
@@ -2468,7 +2397,6 @@
                 <w:sz w:val="18"/>
                 <w:szCs w:val="18"/>
               </w:rPr>
-              <w:fldChar w:fldCharType="begin"/>
             </w:r>
             <w:r>
               <w:rPr>
@@ -2478,7 +2406,6 @@
                 <w:sz w:val="18"/>
                 <w:szCs w:val="18"/>
               </w:rPr>
-              <w:instrText xml:space="preserve"> REF TermMonths </w:instrText>
             </w:r>
             <w:r>
               <w:rPr>
@@ -2488,7 +2415,6 @@
                 <w:sz w:val="18"/>
                 <w:szCs w:val="18"/>
               </w:rPr>
-              <w:instrText xml:space="preserve"> \* MERGEFORMAT </w:instrText>
             </w:r>
             <w:r>
               <w:rPr>
@@ -2498,7 +2424,6 @@
                 <w:sz w:val="18"/>
                 <w:szCs w:val="18"/>
               </w:rPr>
-              <w:fldChar w:fldCharType="end"/>
             </w:r>
             <w:r>
               <w:rPr>
@@ -3587,7 +3512,6 @@
                 <w:sz w:val="18"/>
                 <w:szCs w:val="18"/>
               </w:rPr>
-              <w:fldChar w:fldCharType="begin"/>
             </w:r>
             <w:r>
               <w:rPr>
@@ -3598,7 +3522,6 @@
                 <w:sz w:val="18"/>
                 <w:szCs w:val="18"/>
               </w:rPr>
-              <w:instrText xml:space="preserve"> IF</w:instrText>
             </w:r>
             <w:r>
               <w:rPr>
@@ -3609,7 +3532,6 @@
                 <w:sz w:val="18"/>
                 <w:szCs w:val="18"/>
               </w:rPr>
-              <w:fldChar w:fldCharType="begin"/>
             </w:r>
             <w:r>
               <w:rPr>
@@ -3620,7 +3542,6 @@
                 <w:sz w:val="18"/>
                 <w:szCs w:val="18"/>
               </w:rPr>
-              <w:instrText xml:space="preserve"> REF </w:instrText>
             </w:r>
             <w:r>
               <w:rPr>
@@ -3631,7 +3552,6 @@
                 <w:sz w:val="18"/>
                 <w:szCs w:val="18"/>
               </w:rPr>
-              <w:instrText>VerbalApproval</w:instrText>
             </w:r>
             <w:r>
               <w:rPr>
@@ -3642,7 +3562,6 @@
                 <w:sz w:val="18"/>
                 <w:szCs w:val="18"/>
               </w:rPr>
-              <w:fldChar w:fldCharType="end"/>
             </w:r>
             <w:r>
               <w:rPr>
@@ -3653,7 +3572,6 @@
                 <w:sz w:val="18"/>
                 <w:szCs w:val="18"/>
               </w:rPr>
-              <w:instrText xml:space="preserve"> = "</w:instrText>
             </w:r>
             <w:r>
               <w:rPr>
@@ -3664,7 +3582,6 @@
                 <w:sz w:val="18"/>
                 <w:szCs w:val="18"/>
               </w:rPr>
-              <w:instrText>Y</w:instrText>
             </w:r>
             <w:r>
               <w:rPr>
@@ -3675,7 +3592,6 @@
                 <w:sz w:val="18"/>
                 <w:szCs w:val="18"/>
               </w:rPr>
-              <w:instrText>" "</w:instrText>
             </w:r>
             <w:r>
               <w:rPr>
@@ -3686,7 +3602,6 @@
                 <w:sz w:val="18"/>
                 <w:szCs w:val="18"/>
               </w:rPr>
-              <w:instrText>VERBAL AUTHORIZATION COMPLETE. PLEASE REFER TO TELEPHONIC RECORDING</w:instrText>
             </w:r>
             <w:r>
               <w:rPr>
@@ -3697,7 +3612,6 @@
                 <w:sz w:val="18"/>
                 <w:szCs w:val="18"/>
               </w:rPr>
-              <w:instrText>"</w:instrText>
             </w:r>
             <w:r>
               <w:rPr>
@@ -3708,7 +3622,6 @@
                 <w:sz w:val="18"/>
                 <w:szCs w:val="18"/>
               </w:rPr>
-              <w:instrText xml:space="preserve"> ""</w:instrText>
             </w:r>
             <w:r>
               <w:rPr>
@@ -3719,7 +3632,6 @@
                 <w:sz w:val="18"/>
                 <w:szCs w:val="18"/>
               </w:rPr>
-              <w:instrText xml:space="preserve"> </w:instrText>
             </w:r>
             <w:r>
               <w:rPr>
@@ -3730,7 +3642,6 @@
                 <w:sz w:val="18"/>
                 <w:szCs w:val="18"/>
               </w:rPr>
-              <w:instrText>\* CHARFORMAT</w:instrText>
             </w:r>
             <w:r>
               <w:rPr>
@@ -3741,7 +3652,6 @@
                 <w:sz w:val="18"/>
                 <w:szCs w:val="18"/>
               </w:rPr>
-              <w:fldChar w:fldCharType="end"/>
             </w:r>
           </w:p>
         </w:tc>
@@ -4847,7 +4757,6 @@
                 <w:bCs/>
                 <w:sz w:val="24"/>
               </w:rPr>
-              <w:fldChar w:fldCharType="begin"/>
             </w:r>
             <w:r>
               <w:rPr>
@@ -4855,7 +4764,6 @@
                 <w:bCs/>
                 <w:sz w:val="24"/>
               </w:rPr>
-              <w:instrText xml:space="preserve"> </w:instrText>
             </w:r>
             <w:r>
               <w:rPr>
@@ -4863,7 +4771,6 @@
                 <w:bCs/>
                 <w:sz w:val="24"/>
               </w:rPr>
-              <w:instrText>R</w:instrText>
             </w:r>
             <w:r>
               <w:rPr>
@@ -4871,7 +4778,6 @@
                 <w:bCs/>
                 <w:sz w:val="24"/>
               </w:rPr>
-              <w:instrText xml:space="preserve">EF TDSPname  \* </w:instrText>
             </w:r>
             <w:r>
               <w:rPr>
@@ -4879,7 +4785,6 @@
                 <w:bCs/>
                 <w:sz w:val="24"/>
               </w:rPr>
-              <w:instrText>CHAR</w:instrText>
             </w:r>
             <w:r>
               <w:rPr>
@@ -4887,7 +4792,6 @@
                 <w:bCs/>
                 <w:sz w:val="24"/>
               </w:rPr>
-              <w:instrText xml:space="preserve">FORMAT </w:instrText>
             </w:r>
             <w:r>
               <w:rPr>
@@ -4895,7 +4799,6 @@
                 <w:bCs/>
                 <w:sz w:val="24"/>
               </w:rPr>
-              <w:fldChar w:fldCharType="end"/>
             </w:r>
             <w:r>
               <w:rPr>
@@ -5106,7 +5009,6 @@
                 <w:sz w:val="24"/>
                 <w:szCs w:val="24"/>
               </w:rPr>
-              <w:fldChar w:fldCharType="begin"/>
             </w:r>
             <w:r>
               <w:rPr>
@@ -5115,7 +5017,6 @@
                 <w:sz w:val="24"/>
                 <w:szCs w:val="24"/>
               </w:rPr>
-              <w:instrText xml:space="preserve"> DATE </w:instrText>
             </w:r>
             <w:r>
               <w:rPr>
@@ -5124,7 +5025,6 @@
                 <w:sz w:val="24"/>
                 <w:szCs w:val="24"/>
               </w:rPr>
-              <w:fldChar w:fldCharType="separate"/>
             </w:r>
             <w:r>
               <w:rPr>
@@ -5143,7 +5043,6 @@
                 <w:sz w:val="24"/>
                 <w:szCs w:val="24"/>
               </w:rPr>
-              <w:fldChar w:fldCharType="end"/>
             </w:r>
           </w:p>
         </w:tc>
@@ -6201,27 +6100,13 @@
                 <w:szCs w:val="20"/>
               </w:rPr>
             </w:pPr>
-            <w:r>
-              <w:fldChar w:fldCharType="begin"/>
-            </w:r>
-            <w:r>
-              <w:instrText xml:space="preserve"> =</w:instrText>
-            </w:r>
-            <w:r>
-              <w:fldChar w:fldCharType="begin"/>
-            </w:r>
-            <w:r>
-              <w:instrText xml:space="preserve"> REF Nondemand1500 </w:instrText>
-            </w:r>
-            <w:r>
-              <w:fldChar w:fldCharType="end"/>
-            </w:r>
-            <w:r>
-              <w:instrText>*100 \# #0.0</w:instrText>
-            </w:r>
-            <w:r>
-              <w:fldChar w:fldCharType="end"/>
-            </w:r>
+            <w:r/>
+            <w:r/>
+            <w:r/>
+            <w:r/>
+            <w:r/>
+            <w:r/>
+            <w:r/>
             <w:r>
               <w:rPr>
                 <w:rFonts w:ascii="Times New Roman" w:eastAsia="Times New Roman" w:hAnsi="Times New Roman" w:cs="Times New Roman"/>
@@ -6259,27 +6144,13 @@
                 <w:szCs w:val="20"/>
               </w:rPr>
             </w:pPr>
-            <w:r>
-              <w:fldChar w:fldCharType="begin"/>
-            </w:r>
-            <w:r>
-              <w:instrText xml:space="preserve"> =</w:instrText>
-            </w:r>
-            <w:r>
-              <w:fldChar w:fldCharType="begin"/>
-            </w:r>
-            <w:r>
-              <w:instrText xml:space="preserve"> REF Nondemand2500 </w:instrText>
-            </w:r>
-            <w:r>
-              <w:fldChar w:fldCharType="end"/>
-            </w:r>
-            <w:r>
-              <w:instrText>*100 \# #0.0</w:instrText>
-            </w:r>
-            <w:r>
-              <w:fldChar w:fldCharType="end"/>
-            </w:r>
+            <w:r/>
+            <w:r/>
+            <w:r/>
+            <w:r/>
+            <w:r/>
+            <w:r/>
+            <w:r/>
             <w:r>
               <w:rPr>
                 <w:rFonts w:ascii="Times New Roman" w:eastAsia="Times New Roman" w:hAnsi="Times New Roman" w:cs="Times New Roman"/>
@@ -6317,27 +6188,13 @@
                 <w:szCs w:val="20"/>
               </w:rPr>
             </w:pPr>
-            <w:r>
-              <w:fldChar w:fldCharType="begin"/>
-            </w:r>
-            <w:r>
-              <w:instrText xml:space="preserve"> =</w:instrText>
-            </w:r>
-            <w:r>
-              <w:fldChar w:fldCharType="begin"/>
-            </w:r>
-            <w:r>
-              <w:instrText xml:space="preserve"> REF Nondemand3500 </w:instrText>
-            </w:r>
-            <w:r>
-              <w:fldChar w:fldCharType="end"/>
-            </w:r>
-            <w:r>
-              <w:instrText>*100 \# #0.0</w:instrText>
-            </w:r>
-            <w:r>
-              <w:fldChar w:fldCharType="end"/>
-            </w:r>
+            <w:r/>
+            <w:r/>
+            <w:r/>
+            <w:r/>
+            <w:r/>
+            <w:r/>
+            <w:r/>
             <w:r>
               <w:rPr>
                 <w:rFonts w:ascii="Times New Roman" w:eastAsia="Times New Roman" w:hAnsi="Times New Roman" w:cs="Times New Roman"/>
@@ -6511,27 +6368,13 @@
                 <w:szCs w:val="20"/>
               </w:rPr>
             </w:pPr>
-            <w:r>
-              <w:fldChar w:fldCharType="begin"/>
-            </w:r>
-            <w:r>
-              <w:instrText xml:space="preserve"> =</w:instrText>
-            </w:r>
-            <w:r>
-              <w:fldChar w:fldCharType="begin"/>
-            </w:r>
-            <w:r>
-              <w:instrText xml:space="preserve"> REF Demand1500 </w:instrText>
-            </w:r>
-            <w:r>
-              <w:fldChar w:fldCharType="end"/>
-            </w:r>
-            <w:r>
-              <w:instrText xml:space="preserve">*100 \# #0.0 </w:instrText>
-            </w:r>
-            <w:r>
-              <w:fldChar w:fldCharType="end"/>
-            </w:r>
+            <w:r/>
+            <w:r/>
+            <w:r/>
+            <w:r/>
+            <w:r/>
+            <w:r/>
+            <w:r/>
             <w:r>
               <w:rPr>
                 <w:rFonts w:ascii="Times New Roman" w:eastAsia="Times New Roman" w:hAnsi="Times New Roman" w:cs="Times New Roman"/>
@@ -6569,27 +6412,13 @@
                 <w:szCs w:val="20"/>
               </w:rPr>
             </w:pPr>
-            <w:r>
-              <w:fldChar w:fldCharType="begin"/>
-            </w:r>
-            <w:r>
-              <w:instrText xml:space="preserve"> =</w:instrText>
-            </w:r>
-            <w:r>
-              <w:fldChar w:fldCharType="begin"/>
-            </w:r>
-            <w:r>
-              <w:instrText xml:space="preserve"> REF Demand2500 </w:instrText>
-            </w:r>
-            <w:r>
-              <w:fldChar w:fldCharType="end"/>
-            </w:r>
-            <w:r>
-              <w:instrText>*100 \# #0.0</w:instrText>
-            </w:r>
-            <w:r>
-              <w:fldChar w:fldCharType="end"/>
-            </w:r>
+            <w:r/>
+            <w:r/>
+            <w:r/>
+            <w:r/>
+            <w:r/>
+            <w:r/>
+            <w:r/>
             <w:r>
               <w:rPr>
                 <w:rFonts w:ascii="Times New Roman" w:eastAsia="Times New Roman" w:hAnsi="Times New Roman" w:cs="Times New Roman"/>
@@ -6627,27 +6456,13 @@
                 <w:szCs w:val="20"/>
               </w:rPr>
             </w:pPr>
-            <w:r>
-              <w:fldChar w:fldCharType="begin"/>
-            </w:r>
-            <w:r>
-              <w:instrText xml:space="preserve"> =</w:instrText>
-            </w:r>
-            <w:r>
-              <w:fldChar w:fldCharType="begin"/>
-            </w:r>
-            <w:r>
-              <w:instrText xml:space="preserve"> REF Demand3500 </w:instrText>
-            </w:r>
-            <w:r>
-              <w:fldChar w:fldCharType="end"/>
-            </w:r>
-            <w:r>
-              <w:instrText>*100 \# #0.0</w:instrText>
-            </w:r>
-            <w:r>
-              <w:fldChar w:fldCharType="end"/>
-            </w:r>
+            <w:r/>
+            <w:r/>
+            <w:r/>
+            <w:r/>
+            <w:r/>
+            <w:r/>
+            <w:r/>
             <w:r>
               <w:rPr>
                 <w:rFonts w:ascii="Times New Roman" w:eastAsia="Times New Roman" w:hAnsi="Times New Roman" w:cs="Times New Roman"/>
@@ -7650,7 +7465,6 @@
                 <w:sz w:val="20"/>
                 <w:szCs w:val="20"/>
               </w:rPr>
-              <w:fldChar w:fldCharType="begin"/>
             </w:r>
             <w:r>
               <w:rPr>
@@ -7659,7 +7473,6 @@
                 <w:sz w:val="20"/>
                 <w:szCs w:val="20"/>
               </w:rPr>
-              <w:instrText xml:space="preserve"> =</w:instrText>
             </w:r>
             <w:r>
               <w:rPr>
@@ -7668,7 +7481,6 @@
                 <w:sz w:val="20"/>
                 <w:szCs w:val="20"/>
               </w:rPr>
-              <w:fldChar w:fldCharType="begin"/>
             </w:r>
             <w:r>
               <w:rPr>
@@ -7677,7 +7489,6 @@
                 <w:sz w:val="20"/>
                 <w:szCs w:val="20"/>
               </w:rPr>
-              <w:instrText xml:space="preserve"> REF ContractPrice </w:instrText>
             </w:r>
             <w:r>
               <w:rPr>
@@ -7686,7 +7497,6 @@
                 <w:sz w:val="20"/>
                 <w:szCs w:val="20"/>
               </w:rPr>
-              <w:fldChar w:fldCharType="end"/>
             </w:r>
             <w:r>
               <w:rPr>
@@ -7695,7 +7505,6 @@
                 <w:sz w:val="20"/>
                 <w:szCs w:val="20"/>
               </w:rPr>
-              <w:instrText xml:space="preserve">*100 \# 0.000 </w:instrText>
             </w:r>
             <w:r>
               <w:rPr>
@@ -7704,7 +7513,6 @@
                 <w:sz w:val="20"/>
                 <w:szCs w:val="20"/>
               </w:rPr>
-              <w:fldChar w:fldCharType="end"/>
             </w:r>
             <w:r>
               <w:rPr>
@@ -7990,7 +7798,6 @@
                 <w:sz w:val="20"/>
                 <w:szCs w:val="20"/>
               </w:rPr>
-              <w:fldChar w:fldCharType="begin"/>
             </w:r>
             <w:r>
               <w:rPr>
@@ -7999,7 +7806,6 @@
                 <w:sz w:val="20"/>
                 <w:szCs w:val="20"/>
               </w:rPr>
-              <w:instrText xml:space="preserve"> IF </w:instrText>
             </w:r>
             <w:r>
               <w:rPr>
@@ -8008,7 +7814,6 @@
                 <w:sz w:val="20"/>
                 <w:szCs w:val="20"/>
               </w:rPr>
-              <w:fldChar w:fldCharType="begin"/>
             </w:r>
             <w:r>
               <w:rPr>
@@ -8017,7 +7822,6 @@
                 <w:sz w:val="20"/>
                 <w:szCs w:val="20"/>
               </w:rPr>
-              <w:instrText xml:space="preserve"> REF meterFee </w:instrText>
             </w:r>
             <w:r>
               <w:rPr>
@@ -8026,7 +7830,6 @@
                 <w:sz w:val="20"/>
                 <w:szCs w:val="20"/>
               </w:rPr>
-              <w:fldChar w:fldCharType="end"/>
             </w:r>
             <w:r>
               <w:rPr>
@@ -8035,7 +7838,6 @@
                 <w:sz w:val="20"/>
                 <w:szCs w:val="20"/>
               </w:rPr>
-              <w:instrText xml:space="preserve"> = "" "0.00" </w:instrText>
             </w:r>
             <w:r>
               <w:rPr>
@@ -8044,7 +7846,6 @@
                 <w:sz w:val="20"/>
                 <w:szCs w:val="20"/>
               </w:rPr>
-              <w:fldChar w:fldCharType="begin"/>
             </w:r>
             <w:r>
               <w:rPr>
@@ -8053,7 +7854,6 @@
                 <w:sz w:val="20"/>
                 <w:szCs w:val="20"/>
               </w:rPr>
-              <w:instrText xml:space="preserve"> REF meterFee </w:instrText>
             </w:r>
             <w:r>
               <w:rPr>
@@ -8062,7 +7862,6 @@
                 <w:sz w:val="20"/>
                 <w:szCs w:val="20"/>
               </w:rPr>
-              <w:fldChar w:fldCharType="end"/>
             </w:r>
             <w:r>
               <w:rPr>
@@ -8071,7 +7870,6 @@
                 <w:sz w:val="20"/>
                 <w:szCs w:val="20"/>
               </w:rPr>
-              <w:instrText xml:space="preserve"> </w:instrText>
             </w:r>
             <w:r>
               <w:rPr>
@@ -8080,7 +7878,6 @@
                 <w:sz w:val="20"/>
                 <w:szCs w:val="20"/>
               </w:rPr>
-              <w:fldChar w:fldCharType="separate"/>
             </w:r>
             <w:r>
               <w:rPr>
@@ -8099,7 +7896,6 @@
                 <w:sz w:val="20"/>
                 <w:szCs w:val="20"/>
               </w:rPr>
-              <w:fldChar w:fldCharType="end"/>
             </w:r>
             <w:r>
               <w:rPr>
@@ -8259,7 +8055,6 @@
                 <w:sz w:val="20"/>
                 <w:szCs w:val="20"/>
               </w:rPr>
-              <w:fldChar w:fldCharType="begin"/>
             </w:r>
             <w:r>
               <w:rPr>
@@ -8267,7 +8062,6 @@
                 <w:sz w:val="20"/>
                 <w:szCs w:val="20"/>
               </w:rPr>
-              <w:instrText xml:space="preserve"> IF</w:instrText>
             </w:r>
             <w:r>
               <w:rPr>
@@ -8275,7 +8069,6 @@
                 <w:sz w:val="20"/>
                 <w:szCs w:val="20"/>
               </w:rPr>
-              <w:fldChar w:fldCharType="begin"/>
             </w:r>
             <w:r>
               <w:rPr>
@@ -8283,7 +8076,6 @@
                 <w:sz w:val="20"/>
                 <w:szCs w:val="20"/>
               </w:rPr>
-              <w:instrText xml:space="preserve"> REF TDSPname </w:instrText>
             </w:r>
             <w:r>
               <w:rPr>
@@ -8291,7 +8083,6 @@
                 <w:sz w:val="20"/>
                 <w:szCs w:val="20"/>
               </w:rPr>
-              <w:fldChar w:fldCharType="end"/>
             </w:r>
             <w:r>
               <w:rPr>
@@ -8299,7 +8090,6 @@
                 <w:sz w:val="20"/>
                 <w:szCs w:val="20"/>
               </w:rPr>
-              <w:instrText xml:space="preserve"> = "Lubbock Power &amp; Light" "LP&amp;L is your </w:instrText>
             </w:r>
             <w:r>
               <w:rPr>
@@ -8307,7 +8097,6 @@
                 <w:sz w:val="20"/>
                 <w:szCs w:val="20"/>
               </w:rPr>
-              <w:instrText xml:space="preserve">Transmission and Distribution Service Provider (TDSP). TDSP </w:instrText>
             </w:r>
             <w:r>
               <w:rPr>
@@ -8315,7 +8104,6 @@
                 <w:sz w:val="20"/>
                 <w:szCs w:val="20"/>
               </w:rPr>
-              <w:instrText>c</w:instrText>
             </w:r>
             <w:r>
               <w:rPr>
@@ -8323,7 +8111,6 @@
                 <w:sz w:val="20"/>
                 <w:szCs w:val="20"/>
               </w:rPr>
-              <w:instrText>harges for delivering electricity, including any Demand Charges, will be passed through without markup</w:instrText>
             </w:r>
             <w:r>
               <w:rPr>
@@ -8331,7 +8118,6 @@
                 <w:sz w:val="20"/>
                 <w:szCs w:val="20"/>
               </w:rPr>
-              <w:instrText xml:space="preserve"> (Pass-Through Charges)</w:instrText>
             </w:r>
             <w:r>
               <w:rPr>
@@ -8339,7 +8125,6 @@
                 <w:sz w:val="20"/>
                 <w:szCs w:val="20"/>
               </w:rPr>
-              <w:instrText>.</w:instrText>
             </w:r>
             <w:r>
               <w:rPr>
@@ -8347,7 +8132,6 @@
                 <w:sz w:val="20"/>
                 <w:szCs w:val="20"/>
               </w:rPr>
-              <w:instrText xml:space="preserve"> " "</w:instrText>
             </w:r>
             <w:r>
               <w:rPr>
@@ -8355,7 +8139,6 @@
                 <w:sz w:val="20"/>
                 <w:szCs w:val="20"/>
               </w:rPr>
-              <w:instrText>Transmission and Distribution Service Provider charges (TDSP Pass-Through Charges). TDSP Pass-Through Charges for delivering electricity, including any Demand Charges, will be passed through without markup.</w:instrText>
             </w:r>
             <w:r>
               <w:rPr>
@@ -8363,7 +8146,6 @@
                 <w:sz w:val="20"/>
                 <w:szCs w:val="20"/>
               </w:rPr>
-              <w:instrText xml:space="preserve">" </w:instrText>
             </w:r>
             <w:r>
               <w:rPr>
@@ -8371,7 +8153,6 @@
                 <w:sz w:val="20"/>
                 <w:szCs w:val="20"/>
               </w:rPr>
-              <w:fldChar w:fldCharType="separate"/>
             </w:r>
             <w:r>
               <w:rPr>
@@ -8388,7 +8169,6 @@
                 <w:sz w:val="20"/>
                 <w:szCs w:val="20"/>
               </w:rPr>
-              <w:fldChar w:fldCharType="end"/>
             </w:r>
           </w:p>
           <w:p>
@@ -8558,7 +8338,6 @@
                 <w:sz w:val="20"/>
                 <w:szCs w:val="20"/>
               </w:rPr>
-              <w:fldChar w:fldCharType="begin"/>
             </w:r>
             <w:r>
               <w:rPr>
@@ -8566,7 +8345,6 @@
                 <w:sz w:val="20"/>
                 <w:szCs w:val="20"/>
               </w:rPr>
-              <w:instrText xml:space="preserve"> IF</w:instrText>
             </w:r>
             <w:r>
               <w:rPr>
@@ -8574,7 +8352,6 @@
                 <w:sz w:val="20"/>
                 <w:szCs w:val="20"/>
               </w:rPr>
-              <w:fldChar w:fldCharType="begin"/>
             </w:r>
             <w:r>
               <w:rPr>
@@ -8582,7 +8359,6 @@
                 <w:sz w:val="20"/>
                 <w:szCs w:val="20"/>
               </w:rPr>
-              <w:instrText xml:space="preserve"> REF TDSPname </w:instrText>
             </w:r>
             <w:r>
               <w:rPr>
@@ -8590,7 +8366,6 @@
                 <w:sz w:val="20"/>
                 <w:szCs w:val="20"/>
               </w:rPr>
-              <w:fldChar w:fldCharType="end"/>
             </w:r>
             <w:r>
               <w:rPr>
@@ -8598,7 +8373,6 @@
                 <w:sz w:val="20"/>
                 <w:szCs w:val="20"/>
               </w:rPr>
-              <w:instrText xml:space="preserve"> = "ONCOR" "</w:instrText>
             </w:r>
             <w:r>
               <w:rPr>
@@ -8606,7 +8380,6 @@
                 <w:sz w:val="20"/>
                 <w:szCs w:val="20"/>
               </w:rPr>
-              <w:instrText>For more detail see the Oncor service tariff for a listing of cities and authorized charges.</w:instrText>
             </w:r>
             <w:r>
               <w:rPr>
@@ -8614,7 +8387,6 @@
                 <w:sz w:val="20"/>
                 <w:szCs w:val="20"/>
               </w:rPr>
-              <w:instrText>" ""</w:instrText>
             </w:r>
             <w:r>
               <w:rPr>
@@ -8630,7 +8402,6 @@
                 <w:sz w:val="20"/>
                 <w:szCs w:val="20"/>
               </w:rPr>
-              <w:instrText xml:space="preserve"> </w:instrText>
             </w:r>
             <w:r>
               <w:rPr>
@@ -8638,7 +8409,6 @@
                 <w:sz w:val="20"/>
                 <w:szCs w:val="20"/>
               </w:rPr>
-              <w:fldChar w:fldCharType="end"/>
             </w:r>
             <w:r>
               <w:rPr>
@@ -8647,7 +8417,6 @@
                 <w:sz w:val="20"/>
                 <w:szCs w:val="20"/>
               </w:rPr>
-              <w:fldChar w:fldCharType="begin"/>
             </w:r>
             <w:r>
               <w:rPr>
@@ -8656,7 +8425,6 @@
                 <w:sz w:val="20"/>
                 <w:szCs w:val="20"/>
               </w:rPr>
-              <w:instrText xml:space="preserve"> IF</w:instrText>
             </w:r>
             <w:r>
               <w:rPr>
@@ -8665,7 +8433,6 @@
                 <w:sz w:val="20"/>
                 <w:szCs w:val="20"/>
               </w:rPr>
-              <w:fldChar w:fldCharType="begin"/>
             </w:r>
             <w:r>
               <w:rPr>
@@ -8674,7 +8441,6 @@
                 <w:sz w:val="20"/>
                 <w:szCs w:val="20"/>
               </w:rPr>
-              <w:instrText xml:space="preserve"> REF TDSPname </w:instrText>
             </w:r>
             <w:r>
               <w:rPr>
@@ -8683,7 +8449,6 @@
                 <w:sz w:val="20"/>
                 <w:szCs w:val="20"/>
               </w:rPr>
-              <w:fldChar w:fldCharType="end"/>
             </w:r>
             <w:r>
               <w:rPr>
@@ -8692,7 +8457,6 @@
                 <w:sz w:val="20"/>
                 <w:szCs w:val="20"/>
               </w:rPr>
-              <w:instrText xml:space="preserve"> = "</w:instrText>
             </w:r>
             <w:r>
               <w:rPr>
@@ -8701,7 +8465,6 @@
                 <w:sz w:val="20"/>
                 <w:szCs w:val="20"/>
               </w:rPr>
-              <w:instrText>Central Power &amp; Light</w:instrText>
             </w:r>
             <w:r>
               <w:rPr>
@@ -8710,7 +8473,6 @@
                 <w:sz w:val="20"/>
                 <w:szCs w:val="20"/>
               </w:rPr>
-              <w:instrText>" "</w:instrText>
             </w:r>
           </w:p>
           <w:p>
@@ -8740,7 +8502,6 @@
                 <w:sz w:val="20"/>
                 <w:szCs w:val="20"/>
               </w:rPr>
-              <w:instrText>**Customers in the McAllen/Mission area formerly served by Oncor will not be assessed TC-2, TC-3, NDC, or SRC charges or the ADFIT credit associated with the SRC.</w:instrText>
             </w:r>
             <w:r>
               <w:rPr>
@@ -8749,7 +8510,6 @@
                 <w:sz w:val="20"/>
                 <w:szCs w:val="20"/>
               </w:rPr>
-              <w:instrText xml:space="preserve">" "" </w:instrText>
             </w:r>
             <w:r>
               <w:rPr>
@@ -8758,7 +8518,6 @@
                 <w:sz w:val="20"/>
                 <w:szCs w:val="20"/>
               </w:rPr>
-              <w:fldChar w:fldCharType="end"/>
             </w:r>
             <w:r>
               <w:rPr>
@@ -8766,7 +8525,6 @@
                 <w:sz w:val="20"/>
                 <w:szCs w:val="20"/>
               </w:rPr>
-              <w:fldChar w:fldCharType="begin"/>
             </w:r>
             <w:r>
               <w:rPr>
@@ -8774,7 +8532,6 @@
                 <w:sz w:val="20"/>
                 <w:szCs w:val="20"/>
               </w:rPr>
-              <w:instrText xml:space="preserve"> IF</w:instrText>
             </w:r>
             <w:r>
               <w:rPr>
@@ -8782,7 +8539,6 @@
                 <w:sz w:val="20"/>
                 <w:szCs w:val="20"/>
               </w:rPr>
-              <w:fldChar w:fldCharType="begin"/>
             </w:r>
             <w:r>
               <w:rPr>
@@ -8790,7 +8546,6 @@
                 <w:sz w:val="20"/>
                 <w:szCs w:val="20"/>
               </w:rPr>
-              <w:instrText xml:space="preserve"> REF TDSPname </w:instrText>
             </w:r>
             <w:r>
               <w:rPr>
@@ -8798,7 +8553,6 @@
                 <w:sz w:val="20"/>
                 <w:szCs w:val="20"/>
               </w:rPr>
-              <w:fldChar w:fldCharType="end"/>
             </w:r>
             <w:r>
               <w:rPr>
@@ -8806,7 +8560,6 @@
                 <w:sz w:val="20"/>
                 <w:szCs w:val="20"/>
               </w:rPr>
-              <w:instrText xml:space="preserve"> = "Lubbock Power &amp; Light" "Average Prices assume LP&amp;L Secondary Service </w:instrText>
             </w:r>
             <w:r>
               <w:rPr>
@@ -8814,7 +8567,6 @@
                 <w:sz w:val="20"/>
                 <w:szCs w:val="20"/>
               </w:rPr>
-              <w:instrText xml:space="preserve">Delivery </w:instrText>
             </w:r>
             <w:r>
               <w:rPr>
@@ -8822,7 +8574,6 @@
                 <w:sz w:val="20"/>
                 <w:szCs w:val="20"/>
               </w:rPr>
-              <w:instrText>Charges.  Customers with a Distributed Renewable Generation (DRG) Interconnection Agreement (i.e., solar panels) with LP&amp;L are subject to LP&amp;L DRG Secondary Service Delivery Charges</w:instrText>
             </w:r>
             <w:r>
               <w:rPr>
@@ -8830,7 +8581,6 @@
                 <w:sz w:val="20"/>
                 <w:szCs w:val="20"/>
               </w:rPr>
-              <w:instrText>.</w:instrText>
             </w:r>
             <w:r>
               <w:rPr>
@@ -8838,7 +8588,6 @@
                 <w:sz w:val="20"/>
                 <w:szCs w:val="20"/>
               </w:rPr>
-              <w:instrText xml:space="preserve">" "" </w:instrText>
             </w:r>
             <w:r>
               <w:rPr>
@@ -8846,7 +8595,6 @@
                 <w:sz w:val="20"/>
                 <w:szCs w:val="20"/>
               </w:rPr>
-              <w:fldChar w:fldCharType="end"/>
             </w:r>
             <w:r>
               <w:rPr>
@@ -10170,7 +9918,6 @@
                 <w:sz w:val="20"/>
                 <w:szCs w:val="20"/>
               </w:rPr>
-              <w:fldChar w:fldCharType="begin"/>
             </w:r>
             <w:r>
               <w:rPr>
@@ -10179,7 +9926,6 @@
                 <w:sz w:val="20"/>
                 <w:szCs w:val="20"/>
               </w:rPr>
-              <w:instrText xml:space="preserve"> REF TermMonths </w:instrText>
             </w:r>
             <w:r>
               <w:rPr>
@@ -10188,7 +9934,6 @@
                 <w:sz w:val="20"/>
                 <w:szCs w:val="20"/>
               </w:rPr>
-              <w:fldChar w:fldCharType="end"/>
             </w:r>
             <w:r>
               <w:rPr>
@@ -11036,7 +10781,6 @@
                 <w:sz w:val="20"/>
                 <w:szCs w:val="20"/>
               </w:rPr>
-              <w:fldChar w:fldCharType="begin"/>
             </w:r>
             <w:r>
               <w:rPr>
@@ -11045,7 +10789,6 @@
                 <w:sz w:val="20"/>
                 <w:szCs w:val="20"/>
               </w:rPr>
-              <w:instrText xml:space="preserve"> IF </w:instrText>
             </w:r>
             <w:r>
               <w:rPr>
@@ -11054,7 +10797,6 @@
                 <w:sz w:val="20"/>
                 <w:szCs w:val="20"/>
               </w:rPr>
-              <w:fldChar w:fldCharType="begin"/>
             </w:r>
             <w:r>
               <w:rPr>
@@ -11063,7 +10805,6 @@
                 <w:sz w:val="20"/>
                 <w:szCs w:val="20"/>
               </w:rPr>
-              <w:instrText xml:space="preserve"> REF VRPercent </w:instrText>
             </w:r>
             <w:r>
               <w:rPr>
@@ -11072,7 +10813,6 @@
                 <w:sz w:val="20"/>
                 <w:szCs w:val="20"/>
               </w:rPr>
-              <w:fldChar w:fldCharType="end"/>
             </w:r>
             <w:r>
               <w:rPr>
@@ -11081,7 +10821,6 @@
                 <w:sz w:val="20"/>
                 <w:szCs w:val="20"/>
               </w:rPr>
-              <w:instrText xml:space="preserve"> = "" "24" </w:instrText>
             </w:r>
             <w:r>
               <w:rPr>
@@ -11090,7 +10829,6 @@
                 <w:sz w:val="20"/>
                 <w:szCs w:val="20"/>
               </w:rPr>
-              <w:fldChar w:fldCharType="begin"/>
             </w:r>
             <w:r>
               <w:rPr>
@@ -11099,7 +10837,6 @@
                 <w:sz w:val="20"/>
                 <w:szCs w:val="20"/>
               </w:rPr>
-              <w:instrText xml:space="preserve"> REF VRPercent </w:instrText>
             </w:r>
             <w:r>
               <w:rPr>
@@ -11108,7 +10845,6 @@
                 <w:sz w:val="20"/>
                 <w:szCs w:val="20"/>
               </w:rPr>
-              <w:fldChar w:fldCharType="end"/>
             </w:r>
             <w:r>
               <w:rPr>
@@ -11117,7 +10853,6 @@
                 <w:sz w:val="20"/>
                 <w:szCs w:val="20"/>
               </w:rPr>
-              <w:instrText xml:space="preserve"> </w:instrText>
             </w:r>
             <w:r>
               <w:rPr>
@@ -11126,7 +10861,6 @@
                 <w:sz w:val="20"/>
                 <w:szCs w:val="20"/>
               </w:rPr>
-              <w:fldChar w:fldCharType="separate"/>
             </w:r>
             <w:r>
               <w:rPr>
@@ -11145,7 +10879,6 @@
                 <w:sz w:val="20"/>
                 <w:szCs w:val="20"/>
               </w:rPr>
-              <w:fldChar w:fldCharType="end"/>
             </w:r>
             <w:r>
               <w:rPr>
@@ -11718,7 +11451,6 @@
                 <w:sz w:val="20"/>
                 <w:szCs w:val="20"/>
               </w:rPr>
-              <w:fldChar w:fldCharType="begin"/>
             </w:r>
             <w:r>
               <w:rPr>
@@ -11727,7 +11459,6 @@
                 <w:sz w:val="20"/>
                 <w:szCs w:val="20"/>
               </w:rPr>
-              <w:instrText xml:space="preserve"> REF EFLid </w:instrText>
             </w:r>
             <w:r>
               <w:rPr>
@@ -11736,7 +11467,6 @@
                 <w:sz w:val="20"/>
                 <w:szCs w:val="20"/>
               </w:rPr>
-              <w:fldChar w:fldCharType="end"/>
             </w:r>
           </w:p>
         </w:tc>

</xml_diff>